<commit_message>
Tina Turner: revisão da Parte 5
Co-Authored-By: Claude Opus 5.5 <noreply@anthropic.com>
Claude-Session: https://claude.ai/code/session_01MJjUEEZrxQDEUifKK2vj9g
</commit_message>
<xml_diff>
--- a/roteiros/tina-turner/Tina_Parte5.docx
+++ b/roteiros/tina-turner/Tina_Parte5.docx
@@ -135,7 +135,7 @@
         <w:rPr>
           <w:color w:val="C00000"/>
         </w:rPr>
-        <w:t>Muita gente repetia uma frase. Sem Ike, ela não era nada. Pois foi sem Ike que ela virou a maior estrela da carreira inteira. E o lugar onde isso ficou registrado para sempre foi aqui, no Brasil.</w:t>
+        <w:t>Muita gente repetia uma frase. Sem Ike, ela não era nada. Pois foi sem Ike que Tina ficou maior do que jamais tinha sido. E a prova mais impressionante disso aconteceu aqui, no Brasil, numa noite que entrou para o livro dos recordes.</w:t>
       </w:r>
     </w:p>
     <w:p>
@@ -159,7 +159,7 @@
         <w:rPr>
           <w:color w:val="000000"/>
         </w:rPr>
-        <w:t>Tina Turner fazia a turnê mundial de um disco que tinha sido mais um sucesso. Naquela noite, o maior estádio do país estava lotado.</w:t>
+        <w:t>Tina Turner estava no meio de uma turnê mundial. Naquela noite, o maior estádio do país estava lotado.</w:t>
       </w:r>
     </w:p>
     <w:p>
@@ -199,7 +199,7 @@
         <w:rPr>
           <w:color w:val="000000"/>
         </w:rPr>
-        <w:t>O nome que um homem tinha inventado para prender uma mulher estava sendo gritado por quase duzentas mil pessoas, num estádio do outro lado do mundo.</w:t>
+        <w:t>O nome que um homem tinha inventado para prender uma mulher estava sendo gritado por cento e oitenta mil vozes, num estádio do outro lado do mundo.</w:t>
       </w:r>
     </w:p>
     <w:p>
@@ -207,7 +207,7 @@
         <w:rPr>
           <w:color w:val="000000"/>
         </w:rPr>
-        <w:t>E quem estava em cima daquele palco era ela. Sozinha.</w:t>
+        <w:t>Em cima daquele palco estava ela. Sozinha.</w:t>
       </w:r>
     </w:p>
     <w:p>
@@ -216,6 +216,14 @@
           <w:color w:val="C00000"/>
         </w:rPr>
         <w:t>Guarde essa imagem. Porque o resto da vida de Tina Turner ia trazer de volta, uma por uma, as feridas que ela achava que tinha deixado para trás. E a mais dolorosa delas tinha nome. Craig.</w:t>
+      </w:r>
+    </w:p>
+    <w:p>
+      <w:r>
+        <w:rPr>
+          <w:color w:val="000000"/>
+        </w:rPr>
+        <w:t>Antes disso, a vida deu a Tina uma coisa que ela nunca tinha tido.</w:t>
       </w:r>
     </w:p>
     <w:p>
@@ -279,7 +287,7 @@
         <w:rPr>
           <w:color w:val="000000"/>
         </w:rPr>
-        <w:t>E existe a carta. A carta de desculpas que Ike disse ter escrito e nunca mandado.</w:t>
+        <w:t>Lembra da carta de desculpas que Ike disse ter escrito e nunca mandado? Ela nunca chegou às mãos de Tina.</w:t>
       </w:r>
     </w:p>
     <w:p>
@@ -287,15 +295,7 @@
         <w:rPr>
           <w:color w:val="000000"/>
         </w:rPr>
-        <w:t>Ela nunca chegou.</w:t>
-      </w:r>
-    </w:p>
-    <w:p>
-      <w:r>
-        <w:rPr>
-          <w:color w:val="000000"/>
-        </w:rPr>
-        <w:t>E Tina nunca precisou dela.</w:t>
+        <w:t>Tina também não ficou esperando por ela. Quando Ike morreu, ela já tinha reconstruído a vida inteira com as próprias mãos. O perdão que importava era o que ela mesma decidisse dar.</w:t>
       </w:r>
     </w:p>
     <w:p>
@@ -311,7 +311,7 @@
         <w:rPr>
           <w:color w:val="000000"/>
         </w:rPr>
-        <w:t>Só que a velhice cobrou um preço alto.</w:t>
+        <w:t>Só que o corpo dela cobrou a conta de uma vida inteira.</w:t>
       </w:r>
     </w:p>
     <w:p>
@@ -351,7 +351,7 @@
         <w:rPr>
           <w:color w:val="C00000"/>
         </w:rPr>
-        <w:t>Mas o golpe mais cruel da vida de Tina Turner não veio de Ike. Veio um ano depois do transplante. E atingiu o menino que nasceu em mil novecentos e cinquenta e oito, quando ela tinha dezoito anos e um pai que já tinha ido embora.</w:t>
+        <w:t>Só que o golpe mais cruel da vida de Tina Turner ainda estava por vir. Ele chegou um ano depois do transplante. E atingiu o menino que ela teve aos dezoito anos, em mil novecentos e cinquenta e oito, quando o pai dele já tinha ido embora.</w:t>
       </w:r>
     </w:p>
     <w:p>
@@ -391,7 +391,7 @@
         <w:rPr>
           <w:color w:val="000000"/>
         </w:rPr>
-        <w:t>Tina tinha perdido os dois filhos que carregou.</w:t>
+        <w:t>Tina tinha enterrado os dois filhos que gerou.</w:t>
       </w:r>
     </w:p>
     <w:p>
@@ -463,7 +463,7 @@
         <w:rPr>
           <w:color w:val="000000"/>
         </w:rPr>
-        <w:t>Nos anos seguintes, fez desse nome uma coisa que Ike nunca conseguiu fazer. Tina Turner virou sinônimo de uma mulher que sobreviveu. Que atravessou uma rodovia no escuro com trinta e seis centavos no bolso e saiu do outro lado inteira.</w:t>
+        <w:t>Nos anos seguintes, transformou esse nome em algo que Ike nunca conseguiu controlar. Tina Turner virou o nome de uma mulher que sobreviveu. Uma mulher que atravessou uma rodovia no escuro com trinta e seis centavos no bolso e saiu do outro lado inteira.</w:t>
       </w:r>
     </w:p>
     <w:p>
@@ -471,7 +471,7 @@
         <w:rPr>
           <w:color w:val="000000"/>
         </w:rPr>
-        <w:t>Quando a notícia da morte dela correu o mundo, ninguém lembrou de Ike primeiro.</w:t>
+        <w:t>Quando a notícia da morte dela correu o mundo, as homenagens falavam da voz dela e da força que ela teve para recomeçar.</w:t>
       </w:r>
     </w:p>
     <w:p>
@@ -495,7 +495,7 @@
         <w:rPr>
           <w:color w:val="000000"/>
         </w:rPr>
-        <w:t>Lembra da menina de onze anos em Nutbush? A que viu a mãe ir embora sem levar a filha.</w:t>
+        <w:t>Pense de novo na menina de onze anos em Nutbush. A que viu a mãe ir embora sem levar a filha.</w:t>
       </w:r>
     </w:p>
     <w:p>
@@ -527,7 +527,7 @@
         <w:rPr>
           <w:color w:val="000000"/>
         </w:rPr>
-        <w:t>Gente que sorri na frente dos outros. Que vai trabalhar, vai a festas, posta fotos. E que esconde debaixo da maquiagem o que aconteceu horas antes.</w:t>
+        <w:t>Gente que sorri na frente dos outros e posta fotos felizes. E que esconde debaixo da maquiagem o que aconteceu horas antes.</w:t>
       </w:r>
     </w:p>
     <w:p>

</xml_diff>